<commit_message>
wordbestand, inleidng gemaakt moet alleen nog de deployement diagram aanpassen
</commit_message>
<xml_diff>
--- a/document/SpotitubeDocument.docx
+++ b/document/SpotitubeDocument.docx
@@ -73,11 +73,9 @@
             <w:pPr>
               <w:pStyle w:val="Subtitle"/>
             </w:pPr>
-            <w:proofErr w:type="spellStart"/>
             <w:r>
               <w:t>Spotitube</w:t>
             </w:r>
-            <w:proofErr w:type="spellEnd"/>
           </w:p>
         </w:tc>
       </w:tr>
@@ -170,7 +168,7 @@
               <w:kern w:val="2"/>
               <w:sz w:val="24"/>
               <w:szCs w:val="24"/>
-              <w:lang w:val="en-NL" w:eastAsia="en-NL"/>
+              <w:lang w:eastAsia="en-NL"/>
               <w14:ligatures w14:val="standardContextual"/>
             </w:rPr>
           </w:pPr>
@@ -199,7 +197,7 @@
                 <w:kern w:val="2"/>
                 <w:sz w:val="24"/>
                 <w:szCs w:val="24"/>
-                <w:lang w:val="en-NL" w:eastAsia="en-NL"/>
+                <w:lang w:eastAsia="en-NL"/>
                 <w14:ligatures w14:val="standardContextual"/>
               </w:rPr>
               <w:tab/>
@@ -264,7 +262,7 @@
               <w:kern w:val="2"/>
               <w:sz w:val="24"/>
               <w:szCs w:val="24"/>
-              <w:lang w:val="en-NL" w:eastAsia="en-NL"/>
+              <w:lang w:eastAsia="en-NL"/>
               <w14:ligatures w14:val="standardContextual"/>
             </w:rPr>
           </w:pPr>
@@ -284,7 +282,7 @@
                 <w:kern w:val="2"/>
                 <w:sz w:val="24"/>
                 <w:szCs w:val="24"/>
-                <w:lang w:val="en-NL" w:eastAsia="en-NL"/>
+                <w:lang w:eastAsia="en-NL"/>
                 <w14:ligatures w14:val="standardContextual"/>
               </w:rPr>
               <w:tab/>
@@ -347,7 +345,7 @@
               <w:kern w:val="2"/>
               <w:sz w:val="24"/>
               <w:szCs w:val="24"/>
-              <w:lang w:val="en-NL" w:eastAsia="en-NL"/>
+              <w:lang w:eastAsia="en-NL"/>
               <w14:ligatures w14:val="standardContextual"/>
             </w:rPr>
           </w:pPr>
@@ -365,7 +363,7 @@
                 <w:kern w:val="2"/>
                 <w:sz w:val="24"/>
                 <w:szCs w:val="24"/>
-                <w:lang w:val="en-NL" w:eastAsia="en-NL"/>
+                <w:lang w:eastAsia="en-NL"/>
                 <w14:ligatures w14:val="standardContextual"/>
               </w:rPr>
               <w:tab/>
@@ -428,7 +426,7 @@
               <w:kern w:val="2"/>
               <w:sz w:val="24"/>
               <w:szCs w:val="24"/>
-              <w:lang w:val="en-NL" w:eastAsia="en-NL"/>
+              <w:lang w:eastAsia="en-NL"/>
               <w14:ligatures w14:val="standardContextual"/>
             </w:rPr>
           </w:pPr>
@@ -446,7 +444,7 @@
                 <w:kern w:val="2"/>
                 <w:sz w:val="24"/>
                 <w:szCs w:val="24"/>
-                <w:lang w:val="en-NL" w:eastAsia="en-NL"/>
+                <w:lang w:eastAsia="en-NL"/>
                 <w14:ligatures w14:val="standardContextual"/>
               </w:rPr>
               <w:tab/>
@@ -509,7 +507,7 @@
               <w:kern w:val="2"/>
               <w:sz w:val="24"/>
               <w:szCs w:val="24"/>
-              <w:lang w:val="en-NL" w:eastAsia="en-NL"/>
+              <w:lang w:eastAsia="en-NL"/>
               <w14:ligatures w14:val="standardContextual"/>
             </w:rPr>
           </w:pPr>
@@ -527,7 +525,7 @@
                 <w:kern w:val="2"/>
                 <w:sz w:val="24"/>
                 <w:szCs w:val="24"/>
-                <w:lang w:val="en-NL" w:eastAsia="en-NL"/>
+                <w:lang w:eastAsia="en-NL"/>
                 <w14:ligatures w14:val="standardContextual"/>
               </w:rPr>
               <w:tab/>
@@ -590,7 +588,7 @@
               <w:kern w:val="2"/>
               <w:sz w:val="24"/>
               <w:szCs w:val="24"/>
-              <w:lang w:val="en-NL" w:eastAsia="en-NL"/>
+              <w:lang w:eastAsia="en-NL"/>
               <w14:ligatures w14:val="standardContextual"/>
             </w:rPr>
           </w:pPr>
@@ -608,7 +606,7 @@
                 <w:kern w:val="2"/>
                 <w:sz w:val="24"/>
                 <w:szCs w:val="24"/>
-                <w:lang w:val="en-NL" w:eastAsia="en-NL"/>
+                <w:lang w:eastAsia="en-NL"/>
                 <w14:ligatures w14:val="standardContextual"/>
               </w:rPr>
               <w:tab/>
@@ -673,7 +671,7 @@
               <w:kern w:val="2"/>
               <w:sz w:val="24"/>
               <w:szCs w:val="24"/>
-              <w:lang w:val="en-NL" w:eastAsia="en-NL"/>
+              <w:lang w:eastAsia="en-NL"/>
               <w14:ligatures w14:val="standardContextual"/>
             </w:rPr>
           </w:pPr>
@@ -693,7 +691,7 @@
                 <w:kern w:val="2"/>
                 <w:sz w:val="24"/>
                 <w:szCs w:val="24"/>
-                <w:lang w:val="en-NL" w:eastAsia="en-NL"/>
+                <w:lang w:eastAsia="en-NL"/>
                 <w14:ligatures w14:val="standardContextual"/>
               </w:rPr>
               <w:tab/>
@@ -756,7 +754,7 @@
               <w:kern w:val="2"/>
               <w:sz w:val="24"/>
               <w:szCs w:val="24"/>
-              <w:lang w:val="en-NL" w:eastAsia="en-NL"/>
+              <w:lang w:eastAsia="en-NL"/>
               <w14:ligatures w14:val="standardContextual"/>
             </w:rPr>
           </w:pPr>
@@ -774,7 +772,7 @@
                 <w:kern w:val="2"/>
                 <w:sz w:val="24"/>
                 <w:szCs w:val="24"/>
-                <w:lang w:val="en-NL" w:eastAsia="en-NL"/>
+                <w:lang w:eastAsia="en-NL"/>
                 <w14:ligatures w14:val="standardContextual"/>
               </w:rPr>
               <w:tab/>
@@ -837,7 +835,7 @@
               <w:kern w:val="2"/>
               <w:sz w:val="24"/>
               <w:szCs w:val="24"/>
-              <w:lang w:val="en-NL" w:eastAsia="en-NL"/>
+              <w:lang w:eastAsia="en-NL"/>
               <w14:ligatures w14:val="standardContextual"/>
             </w:rPr>
           </w:pPr>
@@ -855,7 +853,7 @@
                 <w:kern w:val="2"/>
                 <w:sz w:val="24"/>
                 <w:szCs w:val="24"/>
-                <w:lang w:val="en-NL" w:eastAsia="en-NL"/>
+                <w:lang w:eastAsia="en-NL"/>
                 <w14:ligatures w14:val="standardContextual"/>
               </w:rPr>
               <w:tab/>
@@ -918,7 +916,7 @@
               <w:kern w:val="2"/>
               <w:sz w:val="24"/>
               <w:szCs w:val="24"/>
-              <w:lang w:val="en-NL" w:eastAsia="en-NL"/>
+              <w:lang w:eastAsia="en-NL"/>
               <w14:ligatures w14:val="standardContextual"/>
             </w:rPr>
           </w:pPr>
@@ -936,7 +934,7 @@
                 <w:kern w:val="2"/>
                 <w:sz w:val="24"/>
                 <w:szCs w:val="24"/>
-                <w:lang w:val="en-NL" w:eastAsia="en-NL"/>
+                <w:lang w:eastAsia="en-NL"/>
                 <w14:ligatures w14:val="standardContextual"/>
               </w:rPr>
               <w:tab/>
@@ -999,7 +997,7 @@
               <w:kern w:val="2"/>
               <w:sz w:val="24"/>
               <w:szCs w:val="24"/>
-              <w:lang w:val="en-NL" w:eastAsia="en-NL"/>
+              <w:lang w:eastAsia="en-NL"/>
               <w14:ligatures w14:val="standardContextual"/>
             </w:rPr>
           </w:pPr>
@@ -1017,7 +1015,7 @@
                 <w:kern w:val="2"/>
                 <w:sz w:val="24"/>
                 <w:szCs w:val="24"/>
-                <w:lang w:val="en-NL" w:eastAsia="en-NL"/>
+                <w:lang w:eastAsia="en-NL"/>
                 <w14:ligatures w14:val="standardContextual"/>
               </w:rPr>
               <w:tab/>
@@ -1082,7 +1080,7 @@
               <w:kern w:val="2"/>
               <w:sz w:val="24"/>
               <w:szCs w:val="24"/>
-              <w:lang w:val="en-NL" w:eastAsia="en-NL"/>
+              <w:lang w:eastAsia="en-NL"/>
               <w14:ligatures w14:val="standardContextual"/>
             </w:rPr>
           </w:pPr>
@@ -1102,7 +1100,7 @@
                 <w:kern w:val="2"/>
                 <w:sz w:val="24"/>
                 <w:szCs w:val="24"/>
-                <w:lang w:val="en-NL" w:eastAsia="en-NL"/>
+                <w:lang w:eastAsia="en-NL"/>
                 <w14:ligatures w14:val="standardContextual"/>
               </w:rPr>
               <w:tab/>
@@ -1165,7 +1163,7 @@
               <w:kern w:val="2"/>
               <w:sz w:val="24"/>
               <w:szCs w:val="24"/>
-              <w:lang w:val="en-NL" w:eastAsia="en-NL"/>
+              <w:lang w:eastAsia="en-NL"/>
               <w14:ligatures w14:val="standardContextual"/>
             </w:rPr>
           </w:pPr>
@@ -1183,7 +1181,7 @@
                 <w:kern w:val="2"/>
                 <w:sz w:val="24"/>
                 <w:szCs w:val="24"/>
-                <w:lang w:val="en-NL" w:eastAsia="en-NL"/>
+                <w:lang w:eastAsia="en-NL"/>
                 <w14:ligatures w14:val="standardContextual"/>
               </w:rPr>
               <w:tab/>
@@ -1246,7 +1244,7 @@
               <w:kern w:val="2"/>
               <w:sz w:val="24"/>
               <w:szCs w:val="24"/>
-              <w:lang w:val="en-NL" w:eastAsia="en-NL"/>
+              <w:lang w:eastAsia="en-NL"/>
               <w14:ligatures w14:val="standardContextual"/>
             </w:rPr>
           </w:pPr>
@@ -1264,7 +1262,7 @@
                 <w:kern w:val="2"/>
                 <w:sz w:val="24"/>
                 <w:szCs w:val="24"/>
-                <w:lang w:val="en-NL" w:eastAsia="en-NL"/>
+                <w:lang w:eastAsia="en-NL"/>
                 <w14:ligatures w14:val="standardContextual"/>
               </w:rPr>
               <w:tab/>
@@ -1327,7 +1325,7 @@
               <w:kern w:val="2"/>
               <w:sz w:val="24"/>
               <w:szCs w:val="24"/>
-              <w:lang w:val="en-NL" w:eastAsia="en-NL"/>
+              <w:lang w:eastAsia="en-NL"/>
               <w14:ligatures w14:val="standardContextual"/>
             </w:rPr>
           </w:pPr>
@@ -1345,7 +1343,7 @@
                 <w:kern w:val="2"/>
                 <w:sz w:val="24"/>
                 <w:szCs w:val="24"/>
-                <w:lang w:val="en-NL" w:eastAsia="en-NL"/>
+                <w:lang w:eastAsia="en-NL"/>
                 <w14:ligatures w14:val="standardContextual"/>
               </w:rPr>
               <w:tab/>
@@ -1408,7 +1406,7 @@
               <w:kern w:val="2"/>
               <w:sz w:val="24"/>
               <w:szCs w:val="24"/>
-              <w:lang w:val="en-NL" w:eastAsia="en-NL"/>
+              <w:lang w:eastAsia="en-NL"/>
               <w14:ligatures w14:val="standardContextual"/>
             </w:rPr>
           </w:pPr>
@@ -1426,7 +1424,7 @@
                 <w:kern w:val="2"/>
                 <w:sz w:val="24"/>
                 <w:szCs w:val="24"/>
-                <w:lang w:val="en-NL" w:eastAsia="en-NL"/>
+                <w:lang w:eastAsia="en-NL"/>
                 <w14:ligatures w14:val="standardContextual"/>
               </w:rPr>
               <w:tab/>
@@ -1489,7 +1487,7 @@
               <w:kern w:val="2"/>
               <w:sz w:val="24"/>
               <w:szCs w:val="24"/>
-              <w:lang w:val="en-NL" w:eastAsia="en-NL"/>
+              <w:lang w:eastAsia="en-NL"/>
               <w14:ligatures w14:val="standardContextual"/>
             </w:rPr>
           </w:pPr>
@@ -1507,7 +1505,7 @@
                 <w:kern w:val="2"/>
                 <w:sz w:val="24"/>
                 <w:szCs w:val="24"/>
-                <w:lang w:val="en-NL" w:eastAsia="en-NL"/>
+                <w:lang w:eastAsia="en-NL"/>
                 <w14:ligatures w14:val="standardContextual"/>
               </w:rPr>
               <w:tab/>
@@ -1570,7 +1568,7 @@
               <w:kern w:val="2"/>
               <w:sz w:val="24"/>
               <w:szCs w:val="24"/>
-              <w:lang w:val="en-NL" w:eastAsia="en-NL"/>
+              <w:lang w:eastAsia="en-NL"/>
               <w14:ligatures w14:val="standardContextual"/>
             </w:rPr>
           </w:pPr>
@@ -1588,7 +1586,7 @@
                 <w:kern w:val="2"/>
                 <w:sz w:val="24"/>
                 <w:szCs w:val="24"/>
-                <w:lang w:val="en-NL" w:eastAsia="en-NL"/>
+                <w:lang w:eastAsia="en-NL"/>
                 <w14:ligatures w14:val="standardContextual"/>
               </w:rPr>
               <w:tab/>
@@ -1651,7 +1649,7 @@
               <w:kern w:val="2"/>
               <w:sz w:val="24"/>
               <w:szCs w:val="24"/>
-              <w:lang w:val="en-NL" w:eastAsia="en-NL"/>
+              <w:lang w:eastAsia="en-NL"/>
               <w14:ligatures w14:val="standardContextual"/>
             </w:rPr>
           </w:pPr>
@@ -1669,7 +1667,7 @@
                 <w:kern w:val="2"/>
                 <w:sz w:val="24"/>
                 <w:szCs w:val="24"/>
-                <w:lang w:val="en-NL" w:eastAsia="en-NL"/>
+                <w:lang w:eastAsia="en-NL"/>
                 <w14:ligatures w14:val="standardContextual"/>
               </w:rPr>
               <w:tab/>
@@ -1733,11 +1731,11 @@
         </w:p>
       </w:sdtContent>
     </w:sdt>
-    <w:bookmarkStart w:id="0" w:name="_Toc453921976" w:displacedByCustomXml="prev"/>
-    <w:bookmarkStart w:id="1" w:name="_Toc453921523" w:displacedByCustomXml="prev"/>
+    <w:bookmarkStart w:id="0" w:name="_Toc453919959" w:displacedByCustomXml="prev"/>
+    <w:bookmarkStart w:id="1" w:name="_Toc453920324" w:displacedByCustomXml="prev"/>
     <w:bookmarkStart w:id="2" w:name="_Toc453921312" w:displacedByCustomXml="prev"/>
-    <w:bookmarkStart w:id="3" w:name="_Toc453920324" w:displacedByCustomXml="prev"/>
-    <w:bookmarkStart w:id="4" w:name="_Toc453919959" w:displacedByCustomXml="prev"/>
+    <w:bookmarkStart w:id="3" w:name="_Toc453921523" w:displacedByCustomXml="prev"/>
+    <w:bookmarkStart w:id="4" w:name="_Toc453921976" w:displacedByCustomXml="prev"/>
     <w:p>
       <w:r>
         <w:br w:type="page"/>
@@ -1762,14 +1760,19 @@
     <w:p/>
     <w:p/>
     <w:p>
-      <w:pPr>
-        <w:rPr>
-          <w:rFonts w:ascii="Arial Narrow" w:hAnsi="Arial Narrow"/>
-          <w:b/>
-          <w:caps/>
-          <w:sz w:val="28"/>
-        </w:rPr>
-      </w:pPr>
+      <w:r>
+        <w:t>Voor de module Enterprise Application Integration heb ik gewerkt aan de Spotitube-applicatie. Dit is een applicatie waarin Spotify en YouTube gecombineerd worden, zodat gebruikers playlists kunnen bekijken en beheren. In deze opdracht lag de focus op het bouwen van de back-end die communiceert met een bestaande front-end.</w:t>
+      </w:r>
+    </w:p>
+    <w:p>
+      <w:r>
+        <w:t>Tijdens het maken van deze applicatie heb ik gewerkt met verschillende Java EE technologieën, zoals JAX-RS voor het bouwen van REST API’s, CDI voor dependency injection en JDBC voor de communicatie met de database. Daarnaast heb ik de applicatie opgebouwd door middel van een 3-lagenarchitectuur. Hierdoor blijft de code overzichtelijk en beter onderhoudbaar.</w:t>
+      </w:r>
+    </w:p>
+    <w:p>
+      <w:r>
+        <w:t>In dit verslag leg ik uit hoe mijn applicatie is opgebouwd en welke keuzes ik heb gemaakt tijdens het ontwikkelen.</w:t>
+      </w:r>
       <w:r>
         <w:br w:type="page"/>
       </w:r>
@@ -1848,30 +1851,33 @@
       <w:pPr>
         <w:pStyle w:val="Caption"/>
       </w:pPr>
-      <w:proofErr w:type="spellStart"/>
-      <w:r>
-        <w:t>Figure</w:t>
-      </w:r>
-      <w:proofErr w:type="spellEnd"/>
-      <w:r>
-        <w:t xml:space="preserve"> </w:t>
-      </w:r>
-      <w:fldSimple w:instr=" SEQ Figure \* ARABIC ">
-        <w:r>
-          <w:rPr>
-            <w:noProof/>
-          </w:rPr>
-          <w:t>1</w:t>
-        </w:r>
-      </w:fldSimple>
-      <w:r>
-        <w:t xml:space="preserve"> </w:t>
-      </w:r>
-      <w:proofErr w:type="spellStart"/>
-      <w:r>
-        <w:t>PackageDiagram</w:t>
-      </w:r>
-      <w:proofErr w:type="spellEnd"/>
+      <w:r>
+        <w:t xml:space="preserve">Figure </w:t>
+      </w:r>
+      <w:r>
+        <w:fldChar w:fldCharType="begin"/>
+      </w:r>
+      <w:r>
+        <w:instrText xml:space="preserve"> SEQ Figure \* ARABIC </w:instrText>
+      </w:r>
+      <w:r>
+        <w:fldChar w:fldCharType="separate"/>
+      </w:r>
+      <w:r>
+        <w:rPr>
+          <w:noProof/>
+        </w:rPr>
+        <w:t>1</w:t>
+      </w:r>
+      <w:r>
+        <w:rPr>
+          <w:noProof/>
+        </w:rPr>
+        <w:fldChar w:fldCharType="end"/>
+      </w:r>
+      <w:r>
+        <w:t xml:space="preserve"> PackageDiagram</w:t>
+      </w:r>
     </w:p>
     <w:p>
       <w:pPr>
@@ -1880,37 +1886,13 @@
       <w:bookmarkStart w:id="7" w:name="_Toc226051176"/>
       <w:r>
         <w:lastRenderedPageBreak/>
-        <w:t xml:space="preserve">Welke </w:t>
-      </w:r>
-      <w:proofErr w:type="spellStart"/>
-      <w:r>
-        <w:t>requirement</w:t>
-      </w:r>
-      <w:proofErr w:type="spellEnd"/>
-      <w:r>
-        <w:t xml:space="preserve"> wordt geraakt:</w:t>
+        <w:t>Welke requirement wordt geraakt:</w:t>
       </w:r>
       <w:bookmarkEnd w:id="7"/>
     </w:p>
     <w:p>
       <w:r>
-        <w:t xml:space="preserve">Het package diagram toont de gelaagde architectuur van de </w:t>
-      </w:r>
-      <w:proofErr w:type="spellStart"/>
-      <w:r>
-        <w:t>Spotitube</w:t>
-      </w:r>
-      <w:proofErr w:type="spellEnd"/>
-      <w:r>
-        <w:t xml:space="preserve"> applicatie. De applicatie is opgedeeld in drie lagen: de resource laag, de service laag en de datasource laag. Dit voldoet aan de </w:t>
-      </w:r>
-      <w:proofErr w:type="spellStart"/>
-      <w:r>
-        <w:t>requirement</w:t>
-      </w:r>
-      <w:proofErr w:type="spellEnd"/>
-      <w:r>
-        <w:t xml:space="preserve"> dat de applicatie gebouwd moet worden op basis van een gelaagde architectuur.</w:t>
+        <w:t>Het package diagram toont de gelaagde architectuur van de Spotitube applicatie. De applicatie is opgedeeld in drie lagen: de resource laag, de service laag en de datasource laag. Dit voldoet aan de requirement dat de applicatie gebouwd moet worden op basis van een gelaagde architectuur.</w:t>
       </w:r>
     </w:p>
     <w:p/>
@@ -1920,15 +1902,7 @@
       </w:pPr>
       <w:bookmarkStart w:id="8" w:name="_Toc226051177"/>
       <w:r>
-        <w:t xml:space="preserve">Welke design </w:t>
-      </w:r>
-      <w:proofErr w:type="spellStart"/>
-      <w:r>
-        <w:t>patterns</w:t>
-      </w:r>
-      <w:proofErr w:type="spellEnd"/>
-      <w:r>
-        <w:t xml:space="preserve"> zijn toegepast:</w:t>
+        <w:t>Welke design patterns zijn toegepast:</w:t>
       </w:r>
       <w:bookmarkEnd w:id="8"/>
       <w:r>
@@ -1937,15 +1911,7 @@
     </w:p>
     <w:p>
       <w:r>
-        <w:t xml:space="preserve">In de applicatie zijn de volgende design </w:t>
-      </w:r>
-      <w:proofErr w:type="spellStart"/>
-      <w:r>
-        <w:t>patterns</w:t>
-      </w:r>
-      <w:proofErr w:type="spellEnd"/>
-      <w:r>
-        <w:t xml:space="preserve"> toegepast:</w:t>
+        <w:t>In de applicatie zijn de volgende design patterns toegepast:</w:t>
       </w:r>
     </w:p>
     <w:p>
@@ -1960,33 +1926,49 @@
           <w:b/>
           <w:bCs/>
         </w:rPr>
-        <w:t xml:space="preserve">Remote </w:t>
-      </w:r>
-      <w:proofErr w:type="spellStart"/>
+        <w:t>Remote Facade pattern</w:t>
+      </w:r>
       <w:r>
         <w:rPr>
           <w:b/>
           <w:bCs/>
         </w:rPr>
-        <w:t>Facade</w:t>
-      </w:r>
-      <w:proofErr w:type="spellEnd"/>
+        <w:t xml:space="preserve">: </w:t>
+      </w:r>
       <w:r>
         <w:rPr>
           <w:b/>
           <w:bCs/>
         </w:rPr>
-        <w:t xml:space="preserve"> </w:t>
-      </w:r>
-      <w:proofErr w:type="spellStart"/>
+        <w:br/>
+      </w:r>
+      <w:r>
+        <w:t>D</w:t>
+      </w:r>
+      <w:r>
+        <w:t xml:space="preserve">e resource laag biedt een REST API aan via JAX-RS. De LoginResource, PlaylistResource en TrackResource zijn de facades die </w:t>
+      </w:r>
+      <w:r>
+        <w:t xml:space="preserve">HTTP </w:t>
+      </w:r>
+      <w:r>
+        <w:t>verzoeken ontvangen en doorgeven aan de service laag.</w:t>
+      </w:r>
+    </w:p>
+    <w:p>
+      <w:pPr>
+        <w:numPr>
+          <w:ilvl w:val="0"/>
+          <w:numId w:val="23"/>
+        </w:numPr>
+      </w:pPr>
       <w:r>
         <w:rPr>
           <w:b/>
           <w:bCs/>
         </w:rPr>
-        <w:t>pattern</w:t>
-      </w:r>
-      <w:proofErr w:type="spellEnd"/>
+        <w:t>Data Mapper pattern</w:t>
+      </w:r>
       <w:r>
         <w:rPr>
           <w:b/>
@@ -1995,106 +1977,30 @@
         <w:t>:</w:t>
       </w:r>
       <w:r>
+        <w:t xml:space="preserve"> </w:t>
+      </w:r>
+      <w:r>
+        <w:br/>
+        <w:t>D</w:t>
+      </w:r>
+      <w:r>
+        <w:t>e mapper klassen (LoginResponseMapper, PlaylistMapper, TrackMapper) zetten database resultaten om naar DTO-objecten. Dit zorgt ervoor dat de domeinlogica gescheiden is van de database logica.</w:t>
+      </w:r>
+    </w:p>
+    <w:p>
+      <w:pPr>
+        <w:numPr>
+          <w:ilvl w:val="0"/>
+          <w:numId w:val="23"/>
+        </w:numPr>
+      </w:pPr>
+      <w:r>
         <w:rPr>
           <w:b/>
           <w:bCs/>
         </w:rPr>
-        <w:t xml:space="preserve"> </w:t>
-      </w:r>
-      <w:r>
-        <w:rPr>
-          <w:b/>
-          <w:bCs/>
-        </w:rPr>
-        <w:br/>
-      </w:r>
-      <w:r>
-        <w:t>D</w:t>
-      </w:r>
-      <w:r>
-        <w:t xml:space="preserve">e resource laag biedt een REST API aan via JAX-RS. De </w:t>
-      </w:r>
-      <w:proofErr w:type="spellStart"/>
-      <w:r>
-        <w:t>LoginResource</w:t>
-      </w:r>
-      <w:proofErr w:type="spellEnd"/>
-      <w:r>
-        <w:t xml:space="preserve">, </w:t>
-      </w:r>
-      <w:proofErr w:type="spellStart"/>
-      <w:r>
-        <w:t>PlaylistResource</w:t>
-      </w:r>
-      <w:proofErr w:type="spellEnd"/>
-      <w:r>
-        <w:t xml:space="preserve"> en </w:t>
-      </w:r>
-      <w:proofErr w:type="spellStart"/>
-      <w:r>
-        <w:t>TrackResource</w:t>
-      </w:r>
-      <w:proofErr w:type="spellEnd"/>
-      <w:r>
-        <w:t xml:space="preserve"> zijn de </w:t>
-      </w:r>
-      <w:proofErr w:type="spellStart"/>
-      <w:r>
-        <w:t>facades</w:t>
-      </w:r>
-      <w:proofErr w:type="spellEnd"/>
-      <w:r>
-        <w:t xml:space="preserve"> die </w:t>
-      </w:r>
-      <w:r>
-        <w:t xml:space="preserve">HTTP </w:t>
-      </w:r>
-      <w:r>
-        <w:t>verzoeken</w:t>
-      </w:r>
-      <w:r>
-        <w:t xml:space="preserve"> ontvangen en doorgeven aan de service laag.</w:t>
-      </w:r>
-    </w:p>
-    <w:p>
-      <w:pPr>
-        <w:numPr>
-          <w:ilvl w:val="0"/>
-          <w:numId w:val="23"/>
-        </w:numPr>
-      </w:pPr>
-      <w:r>
-        <w:rPr>
-          <w:b/>
-          <w:bCs/>
-        </w:rPr>
-        <w:t xml:space="preserve">Data </w:t>
-      </w:r>
-      <w:proofErr w:type="spellStart"/>
-      <w:r>
-        <w:rPr>
-          <w:b/>
-          <w:bCs/>
-        </w:rPr>
-        <w:t>Mapper</w:t>
-      </w:r>
-      <w:proofErr w:type="spellEnd"/>
-      <w:r>
-        <w:rPr>
-          <w:b/>
-          <w:bCs/>
-        </w:rPr>
-        <w:t xml:space="preserve"> </w:t>
-      </w:r>
-      <w:proofErr w:type="spellStart"/>
-      <w:r>
-        <w:rPr>
-          <w:b/>
-          <w:bCs/>
-        </w:rPr>
-        <w:t>pattern</w:t>
-      </w:r>
-      <w:proofErr w:type="spellEnd"/>
+        <w:t>Separated Interface pattern</w:t>
+      </w:r>
       <w:r>
         <w:rPr>
           <w:b/>
@@ -2107,239 +2013,65 @@
       </w:r>
       <w:r>
         <w:br/>
-        <w:t>D</w:t>
-      </w:r>
-      <w:r>
-        <w:t xml:space="preserve">e </w:t>
-      </w:r>
-      <w:proofErr w:type="spellStart"/>
-      <w:r>
-        <w:t>mapper</w:t>
-      </w:r>
-      <w:proofErr w:type="spellEnd"/>
-      <w:r>
-        <w:t xml:space="preserve"> klassen (</w:t>
-      </w:r>
-      <w:proofErr w:type="spellStart"/>
-      <w:r>
-        <w:t>LoginResponseMapper</w:t>
-      </w:r>
-      <w:proofErr w:type="spellEnd"/>
-      <w:r>
-        <w:t xml:space="preserve">, </w:t>
-      </w:r>
-      <w:proofErr w:type="spellStart"/>
-      <w:r>
-        <w:t>PlaylistMapper</w:t>
-      </w:r>
-      <w:proofErr w:type="spellEnd"/>
-      <w:r>
-        <w:t xml:space="preserve">, </w:t>
-      </w:r>
-      <w:proofErr w:type="spellStart"/>
-      <w:r>
-        <w:t>TrackMapper</w:t>
-      </w:r>
-      <w:proofErr w:type="spellEnd"/>
-      <w:r>
-        <w:t xml:space="preserve">) zetten database resultaten om naar </w:t>
-      </w:r>
-      <w:r>
-        <w:t>DTO-objecten</w:t>
-      </w:r>
-      <w:r>
-        <w:t>. Dit zorgt ervoor dat de domeinlogica gescheiden is van de database logica.</w:t>
+        <w:t>E</w:t>
+      </w:r>
+      <w:r>
+        <w:t>lke laag communiceert via interfaces met de laag eronder. De resource laag gebruikt ILoginService, IPlaylistService en ITrackService. De datasource laag gebruikt IDatabaseConnector en IMapper. Dit verlaagt de koppeling tussen de lagen.</w:t>
       </w:r>
     </w:p>
     <w:p>
       <w:pPr>
-        <w:numPr>
-          <w:ilvl w:val="0"/>
-          <w:numId w:val="23"/>
-        </w:numPr>
-      </w:pPr>
-      <w:proofErr w:type="spellStart"/>
-      <w:r>
         <w:rPr>
           <w:b/>
           <w:bCs/>
         </w:rPr>
-        <w:t>Separated</w:t>
-      </w:r>
-      <w:proofErr w:type="spellEnd"/>
-      <w:r>
+      </w:pPr>
+    </w:p>
+    <w:p>
+      <w:pPr>
+        <w:pStyle w:val="Heading2"/>
+      </w:pPr>
+      <w:bookmarkStart w:id="9" w:name="_Toc226051178"/>
+      <w:r>
+        <w:t>Wat een alternatieve oplossing zou zijn</w:t>
+      </w:r>
+      <w:r>
+        <w:t>:</w:t>
+      </w:r>
+      <w:bookmarkEnd w:id="9"/>
+      <w:r>
+        <w:t xml:space="preserve"> </w:t>
+      </w:r>
+    </w:p>
+    <w:p>
+      <w:r>
+        <w:t>Een alternatieve oplossing zou zijn om geen interfaces te gebruiken maar direct de concrete klassen te injecteren. Dit zou de code eenvoudiger maken maar de koppeling tussen de lagen verhogen. Een ander alternatief zou zijn om een ORM framework zoals Hibernate te gebruiken in plaats van JDBC, waardoor de Data Mapper klassen niet meer nodig zouden zijn.</w:t>
+      </w:r>
+    </w:p>
+    <w:p>
+      <w:pPr>
         <w:rPr>
           <w:b/>
           <w:bCs/>
         </w:rPr>
-        <w:t xml:space="preserve"> Interface </w:t>
-      </w:r>
-      <w:proofErr w:type="spellStart"/>
-      <w:r>
-        <w:rPr>
-          <w:b/>
-          <w:bCs/>
-        </w:rPr>
-        <w:t>pattern</w:t>
-      </w:r>
-      <w:proofErr w:type="spellEnd"/>
-      <w:r>
-        <w:rPr>
-          <w:b/>
-          <w:bCs/>
-        </w:rPr>
-        <w:t>:</w:t>
-      </w:r>
-      <w:r>
-        <w:t xml:space="preserve"> </w:t>
-      </w:r>
-      <w:r>
-        <w:br/>
-        <w:t>E</w:t>
-      </w:r>
-      <w:r>
-        <w:t xml:space="preserve">lke laag communiceert via interfaces met de laag eronder. De resource laag gebruikt </w:t>
-      </w:r>
-      <w:proofErr w:type="spellStart"/>
-      <w:r>
-        <w:t>ILoginService</w:t>
-      </w:r>
-      <w:proofErr w:type="spellEnd"/>
-      <w:r>
-        <w:t xml:space="preserve">, </w:t>
-      </w:r>
-      <w:proofErr w:type="spellStart"/>
-      <w:r>
-        <w:t>IPlaylistService</w:t>
-      </w:r>
-      <w:proofErr w:type="spellEnd"/>
-      <w:r>
-        <w:t xml:space="preserve"> en </w:t>
-      </w:r>
-      <w:proofErr w:type="spellStart"/>
-      <w:r>
-        <w:t>ITrackService</w:t>
-      </w:r>
-      <w:proofErr w:type="spellEnd"/>
-      <w:r>
-        <w:t xml:space="preserve">. De datasource laag gebruikt </w:t>
-      </w:r>
-      <w:proofErr w:type="spellStart"/>
-      <w:r>
-        <w:t>IDatabaseConnector</w:t>
-      </w:r>
-      <w:proofErr w:type="spellEnd"/>
-      <w:r>
-        <w:t xml:space="preserve"> en </w:t>
-      </w:r>
-      <w:proofErr w:type="spellStart"/>
-      <w:r>
-        <w:t>IMapper</w:t>
-      </w:r>
-      <w:proofErr w:type="spellEnd"/>
-      <w:r>
-        <w:t>. Dit verlaagt de koppeling tussen de lagen.</w:t>
-      </w:r>
+      </w:pPr>
     </w:p>
     <w:p>
       <w:pPr>
-        <w:rPr>
-          <w:b/>
-          <w:bCs/>
-        </w:rPr>
-      </w:pPr>
+        <w:pStyle w:val="Heading2"/>
+      </w:pPr>
+      <w:bookmarkStart w:id="10" w:name="_Toc226051179"/>
+      <w:r>
+        <w:t>Waarom voor de huidige oplossing gekozen:</w:t>
+      </w:r>
+      <w:bookmarkEnd w:id="10"/>
+      <w:r>
+        <w:t xml:space="preserve"> </w:t>
+      </w:r>
     </w:p>
     <w:p>
-      <w:pPr>
-        <w:pStyle w:val="Heading2"/>
-      </w:pPr>
-      <w:bookmarkStart w:id="9" w:name="_Toc226051178"/>
-      <w:r>
-        <w:t>Wat een alternatieve oplossing zou zijn</w:t>
-      </w:r>
-      <w:r>
-        <w:t>:</w:t>
-      </w:r>
-      <w:bookmarkEnd w:id="9"/>
-      <w:r>
-        <w:t xml:space="preserve"> </w:t>
-      </w:r>
-    </w:p>
-    <w:p>
-      <w:r>
-        <w:t xml:space="preserve">Een alternatieve oplossing zou zijn om geen interfaces te gebruiken maar direct de concrete klassen te injecteren. Dit zou de code eenvoudiger maken maar de koppeling tussen de lagen verhogen. Een </w:t>
-      </w:r>
-      <w:r>
-        <w:t>ander</w:t>
-      </w:r>
-      <w:r>
-        <w:t xml:space="preserve"> alternatief zou zijn om een ORM </w:t>
-      </w:r>
-      <w:proofErr w:type="spellStart"/>
-      <w:r>
-        <w:t>framework</w:t>
-      </w:r>
-      <w:proofErr w:type="spellEnd"/>
-      <w:r>
-        <w:t xml:space="preserve"> zoals </w:t>
-      </w:r>
-      <w:proofErr w:type="spellStart"/>
-      <w:r>
-        <w:t>Hibernate</w:t>
-      </w:r>
-      <w:proofErr w:type="spellEnd"/>
-      <w:r>
-        <w:t xml:space="preserve"> te gebruiken in plaats van JDBC, waardoor de Data </w:t>
-      </w:r>
-      <w:proofErr w:type="spellStart"/>
-      <w:r>
-        <w:t>Mapper</w:t>
-      </w:r>
-      <w:proofErr w:type="spellEnd"/>
-      <w:r>
-        <w:t xml:space="preserve"> klassen niet meer nodig zouden zijn.</w:t>
-      </w:r>
-    </w:p>
-    <w:p>
-      <w:pPr>
-        <w:rPr>
-          <w:b/>
-          <w:bCs/>
-        </w:rPr>
-      </w:pPr>
-    </w:p>
-    <w:p>
-      <w:pPr>
-        <w:pStyle w:val="Heading2"/>
-      </w:pPr>
-      <w:bookmarkStart w:id="10" w:name="_Toc226051179"/>
-      <w:r>
-        <w:t>Waarom voor de huidige oplossing gekozen:</w:t>
-      </w:r>
-      <w:bookmarkEnd w:id="10"/>
-      <w:r>
-        <w:t xml:space="preserve"> </w:t>
-      </w:r>
-    </w:p>
-    <w:p>
-      <w:r>
-        <w:t xml:space="preserve">Er is gekozen voor de huidige oplossing omdat de opdracht specifiek vraagt om het gebruik van JAX-RS, CDI en JDBC. De interfaces zorgen ervoor dat de lagen los van elkaar staan, waardoor het makkelijker is om de applicatie te testen met unittests. Door </w:t>
-      </w:r>
-      <w:proofErr w:type="spellStart"/>
-      <w:r>
-        <w:t>Mockito</w:t>
-      </w:r>
-      <w:proofErr w:type="spellEnd"/>
-      <w:r>
-        <w:t xml:space="preserve"> te gebruiken kunnen de interfaces </w:t>
-      </w:r>
-      <w:proofErr w:type="spellStart"/>
-      <w:r>
-        <w:t>gemockt</w:t>
-      </w:r>
-      <w:proofErr w:type="spellEnd"/>
-      <w:r>
-        <w:t xml:space="preserve"> worden zonder dat de echte implementatie of database nodig is.</w:t>
+      <w:r>
+        <w:t>Er is gekozen voor de huidige oplossing omdat de opdracht specifiek vraagt om het gebruik van JAX-RS, CDI en JDBC. De interfaces zorgen ervoor dat de lagen los van elkaar staan, waardoor het makkelijker is om de applicatie te testen met unittests. Door Mockito te gebruiken kunnen de interfaces gemockt worden zonder dat de echte implementatie of database nodig is.</w:t>
       </w:r>
     </w:p>
     <w:p>
@@ -2420,15 +2152,7 @@
       </w:pPr>
       <w:bookmarkStart w:id="12" w:name="_Toc226051181"/>
       <w:r>
-        <w:t xml:space="preserve">Welke </w:t>
-      </w:r>
-      <w:proofErr w:type="spellStart"/>
-      <w:r>
-        <w:t>requirement</w:t>
-      </w:r>
-      <w:proofErr w:type="spellEnd"/>
-      <w:r>
-        <w:t xml:space="preserve"> wordt geraakt:</w:t>
+        <w:t>Welke requirement wordt geraakt:</w:t>
       </w:r>
       <w:bookmarkEnd w:id="12"/>
       <w:r>
@@ -2437,71 +2161,19 @@
     </w:p>
     <w:p>
       <w:r>
-        <w:t xml:space="preserve">Het deployment diagram toont de </w:t>
-      </w:r>
-      <w:proofErr w:type="spellStart"/>
-      <w:r>
-        <w:t>runtime</w:t>
-      </w:r>
-      <w:proofErr w:type="spellEnd"/>
+        <w:t>Het deployment diagram toont de runtime</w:t>
+      </w:r>
       <w:r>
         <w:t xml:space="preserve"> </w:t>
       </w:r>
       <w:r>
-        <w:t xml:space="preserve">omgeving van de </w:t>
-      </w:r>
-      <w:proofErr w:type="spellStart"/>
-      <w:r>
-        <w:t>Spotitube</w:t>
-      </w:r>
-      <w:proofErr w:type="spellEnd"/>
-      <w:r>
-        <w:t xml:space="preserve"> applicatie. De applicatie moet </w:t>
-      </w:r>
-      <w:proofErr w:type="spellStart"/>
-      <w:r>
-        <w:t>gedeployed</w:t>
-      </w:r>
-      <w:proofErr w:type="spellEnd"/>
-      <w:r>
-        <w:t xml:space="preserve"> kunnen worden op een Jakarta EE applicatieserver en moet </w:t>
-      </w:r>
-      <w:proofErr w:type="spellStart"/>
-      <w:r>
-        <w:t>runtime</w:t>
-      </w:r>
-      <w:proofErr w:type="spellEnd"/>
-      <w:r>
-        <w:t xml:space="preserve"> via een configuratiebestand van database kunnen wisselen. Dit is zichtbaar in het diagram door de </w:t>
-      </w:r>
-      <w:proofErr w:type="spellStart"/>
-      <w:proofErr w:type="gramStart"/>
-      <w:r>
-        <w:t>database.properties</w:t>
-      </w:r>
-      <w:proofErr w:type="spellEnd"/>
-      <w:proofErr w:type="gramEnd"/>
-      <w:r>
-        <w:t xml:space="preserve"> als &lt;&lt;</w:t>
-      </w:r>
-      <w:proofErr w:type="spellStart"/>
-      <w:r>
-        <w:t>DeploymentSpec</w:t>
-      </w:r>
-      <w:proofErr w:type="spellEnd"/>
+        <w:t>omgeving van de Spotitube applicatie. De applicatie moet gedeployed kunnen worden op een Jakarta EE applicatieserver en moet runtime via een configuratiebestand van database kunnen wisselen. Dit is zichtbaar in het diagram door de database.properties als &lt;&lt;DeploymentSpec</w:t>
+      </w:r>
       <w:r>
         <w:t>&gt;</w:t>
       </w:r>
       <w:r>
-        <w:t xml:space="preserve">&gt; binnen de </w:t>
-      </w:r>
-      <w:proofErr w:type="spellStart"/>
-      <w:r>
-        <w:t>Spotitube.war</w:t>
-      </w:r>
-      <w:proofErr w:type="spellEnd"/>
-      <w:r>
-        <w:t>.</w:t>
+        <w:t>&gt; binnen de Spotitube.war.</w:t>
       </w:r>
     </w:p>
     <w:p>
@@ -2518,15 +2190,7 @@
       </w:pPr>
       <w:bookmarkStart w:id="13" w:name="_Toc226051182"/>
       <w:r>
-        <w:t xml:space="preserve">Welke design </w:t>
-      </w:r>
-      <w:proofErr w:type="spellStart"/>
-      <w:r>
-        <w:t>patterns</w:t>
-      </w:r>
-      <w:proofErr w:type="spellEnd"/>
-      <w:r>
-        <w:t xml:space="preserve"> zijn toegepast:</w:t>
+        <w:t>Welke design patterns zijn toegepast:</w:t>
       </w:r>
       <w:bookmarkEnd w:id="13"/>
     </w:p>
@@ -2542,33 +2206,8 @@
           <w:b/>
           <w:bCs/>
         </w:rPr>
-        <w:t xml:space="preserve">Remote </w:t>
-      </w:r>
-      <w:proofErr w:type="spellStart"/>
-      <w:r>
-        <w:rPr>
-          <w:b/>
-          <w:bCs/>
-        </w:rPr>
-        <w:t>Facade</w:t>
-      </w:r>
-      <w:proofErr w:type="spellEnd"/>
-      <w:r>
-        <w:rPr>
-          <w:b/>
-          <w:bCs/>
-        </w:rPr>
-        <w:t xml:space="preserve"> </w:t>
-      </w:r>
-      <w:proofErr w:type="spellStart"/>
-      <w:r>
-        <w:rPr>
-          <w:b/>
-          <w:bCs/>
-        </w:rPr>
-        <w:t>pattern</w:t>
-      </w:r>
-      <w:proofErr w:type="spellEnd"/>
+        <w:t>Remote Facade pattern</w:t>
+      </w:r>
       <w:r>
         <w:rPr>
           <w:b/>
@@ -2587,23 +2226,7 @@
         <w:t>D</w:t>
       </w:r>
       <w:r>
-        <w:t xml:space="preserve">e </w:t>
-      </w:r>
-      <w:proofErr w:type="spellStart"/>
-      <w:r>
-        <w:t>Spotitube.war</w:t>
-      </w:r>
-      <w:proofErr w:type="spellEnd"/>
-      <w:r>
-        <w:t xml:space="preserve"> biedt een REST API aan via HTTP/JSON op poort 8080. De </w:t>
-      </w:r>
-      <w:proofErr w:type="spellStart"/>
-      <w:r>
-        <w:t>Angular</w:t>
-      </w:r>
-      <w:proofErr w:type="spellEnd"/>
-      <w:r>
-        <w:t xml:space="preserve"> client communiceert via dit protocol met de backend.</w:t>
+        <w:t>e Spotitube.war biedt een REST API aan via HTTP/JSON op poort 8080. De Angular client communiceert via dit protocol met de backend.</w:t>
       </w:r>
     </w:p>
     <w:p>
@@ -2618,17 +2241,8 @@
           <w:b/>
           <w:bCs/>
         </w:rPr>
-        <w:t xml:space="preserve">Database configuratie via </w:t>
-      </w:r>
-      <w:proofErr w:type="spellStart"/>
-      <w:r>
-        <w:rPr>
-          <w:b/>
-          <w:bCs/>
-        </w:rPr>
-        <w:t>properties</w:t>
-      </w:r>
-      <w:proofErr w:type="spellEnd"/>
+        <w:t>Database configuratie via properties</w:t>
+      </w:r>
       <w:r>
         <w:rPr>
           <w:b/>
@@ -2647,33 +2261,7 @@
         <w:t>D</w:t>
       </w:r>
       <w:r>
-        <w:t xml:space="preserve">oor de </w:t>
-      </w:r>
-      <w:proofErr w:type="spellStart"/>
-      <w:proofErr w:type="gramStart"/>
-      <w:r>
-        <w:t>database.properties</w:t>
-      </w:r>
-      <w:proofErr w:type="spellEnd"/>
-      <w:proofErr w:type="gramEnd"/>
-      <w:r>
-        <w:t xml:space="preserve"> als &lt;&lt;</w:t>
-      </w:r>
-      <w:proofErr w:type="spellStart"/>
-      <w:r>
-        <w:t>DeploymentSpec</w:t>
-      </w:r>
-      <w:proofErr w:type="spellEnd"/>
-      <w:r>
-        <w:t xml:space="preserve">&gt;&gt; op te nemen kan er </w:t>
-      </w:r>
-      <w:proofErr w:type="spellStart"/>
-      <w:r>
-        <w:t>runtime</w:t>
-      </w:r>
-      <w:proofErr w:type="spellEnd"/>
-      <w:r>
-        <w:t xml:space="preserve"> gewisseld worden van database zonder de applicatie opnieuw te compileren. Alleen het configuratiebestand hoeft aangepast te worden.</w:t>
+        <w:t>oor de database.properties als &lt;&lt;DeploymentSpec&gt;&gt; op te nemen kan er runtime gewisseld worden van database zonder de applicatie opnieuw te compileren. Alleen het configuratiebestand hoeft aangepast te worden.</w:t>
       </w:r>
     </w:p>
     <w:p>
@@ -2699,45 +2287,13 @@
     </w:p>
     <w:p>
       <w:r>
-        <w:t xml:space="preserve">Een alternatieve oplossing zou zijn om de database configuratie hard te coderen in de applicatie. Dit zou eenvoudiger zijn maar het zou niet mogelijk zijn om </w:t>
-      </w:r>
-      <w:proofErr w:type="spellStart"/>
-      <w:r>
-        <w:t>runtime</w:t>
-      </w:r>
-      <w:proofErr w:type="spellEnd"/>
-      <w:r>
-        <w:t xml:space="preserve"> van database te wisselen. Een </w:t>
+        <w:t xml:space="preserve">Een alternatieve oplossing zou zijn om de database configuratie hard te coderen in de applicatie. Dit zou eenvoudiger zijn maar het zou niet mogelijk zijn om runtime van database te wisselen. Een </w:t>
       </w:r>
       <w:r>
         <w:t>ander</w:t>
       </w:r>
       <w:r>
-        <w:t xml:space="preserve"> alternatief zou zijn om een andere applicatieserver te gebruiken zoals Apache </w:t>
-      </w:r>
-      <w:proofErr w:type="spellStart"/>
-      <w:r>
-        <w:t>TomEE</w:t>
-      </w:r>
-      <w:proofErr w:type="spellEnd"/>
-      <w:r>
-        <w:t xml:space="preserve"> of </w:t>
-      </w:r>
-      <w:proofErr w:type="spellStart"/>
-      <w:r>
-        <w:t>Payara</w:t>
-      </w:r>
-      <w:proofErr w:type="spellEnd"/>
-      <w:r>
-        <w:t xml:space="preserve"> in plaats van </w:t>
-      </w:r>
-      <w:proofErr w:type="spellStart"/>
-      <w:r>
-        <w:t>WildFly</w:t>
-      </w:r>
-      <w:proofErr w:type="spellEnd"/>
-      <w:r>
-        <w:t>.</w:t>
+        <w:t xml:space="preserve"> alternatief zou zijn om een andere applicatieserver te gebruiken zoals Apache TomEE of Payara in plaats van WildFly.</w:t>
       </w:r>
     </w:p>
     <w:p>
@@ -2763,41 +2319,7 @@
     </w:p>
     <w:p>
       <w:r>
-        <w:t xml:space="preserve">Er is gekozen voor </w:t>
-      </w:r>
-      <w:proofErr w:type="spellStart"/>
-      <w:r>
-        <w:t>WildFly</w:t>
-      </w:r>
-      <w:proofErr w:type="spellEnd"/>
-      <w:r>
-        <w:t xml:space="preserve"> als applicatieserver omdat dit een populaire Jakarta EE server is die veel gebruikt wordt bij de HAN. </w:t>
-      </w:r>
-      <w:proofErr w:type="spellStart"/>
-      <w:r>
-        <w:t>WildFly</w:t>
-      </w:r>
-      <w:proofErr w:type="spellEnd"/>
-      <w:r>
-        <w:t xml:space="preserve"> ondersteunt volledig Jakarta EE 11 wat nodig is voor CDI en JAX-RS. De </w:t>
-      </w:r>
-      <w:proofErr w:type="spellStart"/>
-      <w:proofErr w:type="gramStart"/>
-      <w:r>
-        <w:t>database.properties</w:t>
-      </w:r>
-      <w:proofErr w:type="spellEnd"/>
-      <w:proofErr w:type="gramEnd"/>
-      <w:r>
-        <w:t xml:space="preserve"> zorgt ervoor dat de applicatie flexibel is door alleen het configuratiebestand aan te passen kan er gewisseld worden tussen bijvoorbeeld </w:t>
-      </w:r>
-      <w:proofErr w:type="spellStart"/>
-      <w:r>
-        <w:t>MySQL</w:t>
-      </w:r>
-      <w:proofErr w:type="spellEnd"/>
-      <w:r>
-        <w:t xml:space="preserve"> en SQL Server zonder de code aan te passen.</w:t>
+        <w:t>Er is gekozen voor WildFly als applicatieserver omdat dit een populaire Jakarta EE server is die veel gebruikt wordt bij de HAN. WildFly ondersteunt volledig Jakarta EE 11 wat nodig is voor CDI en JAX-RS. De database.properties zorgt ervoor dat de applicatie flexibel is door alleen het configuratiebestand aan te passen kan er gewisseld worden tussen bijvoorbeeld MySQL en SQL Server zonder de code aan te passen.</w:t>
       </w:r>
     </w:p>
     <w:p/>
@@ -2836,21 +2358,8 @@
         <w:pStyle w:val="Heading2"/>
       </w:pPr>
       <w:bookmarkStart w:id="18" w:name="_Toc226051187"/>
-      <w:proofErr w:type="spellStart"/>
-      <w:r>
-        <w:t>Dependency</w:t>
-      </w:r>
-      <w:proofErr w:type="spellEnd"/>
-      <w:r>
-        <w:t xml:space="preserve"> </w:t>
-      </w:r>
-      <w:proofErr w:type="spellStart"/>
-      <w:r>
-        <w:t>Injection</w:t>
-      </w:r>
-      <w:proofErr w:type="spellEnd"/>
-      <w:r>
-        <w:t xml:space="preserve"> via CDI</w:t>
+      <w:r>
+        <w:t>Dependency Injection via CDI</w:t>
       </w:r>
       <w:r>
         <w:t>:</w:t>
@@ -2859,31 +2368,7 @@
     </w:p>
     <w:p>
       <w:r>
-        <w:t xml:space="preserve">In plaats van het gebruik van new om objecten aan te maken, wordt CDI gebruikt om afhankelijkheden te injecteren via @Inject. Dit zorgt ervoor dat de lagen los van elkaar staan en makkelijk te testen zijn. Door gebruik te maken van interfaces zoals </w:t>
-      </w:r>
-      <w:proofErr w:type="spellStart"/>
-      <w:r>
-        <w:t>ILoginService</w:t>
-      </w:r>
-      <w:proofErr w:type="spellEnd"/>
-      <w:r>
-        <w:t xml:space="preserve">, </w:t>
-      </w:r>
-      <w:proofErr w:type="spellStart"/>
-      <w:r>
-        <w:t>IPlaylistService</w:t>
-      </w:r>
-      <w:proofErr w:type="spellEnd"/>
-      <w:r>
-        <w:t xml:space="preserve"> en </w:t>
-      </w:r>
-      <w:proofErr w:type="spellStart"/>
-      <w:r>
-        <w:t>ITrackService</w:t>
-      </w:r>
-      <w:proofErr w:type="spellEnd"/>
-      <w:r>
-        <w:t xml:space="preserve"> weet de resource laag niet welke implementatie er achter de interface zit.</w:t>
+        <w:t>In plaats van het gebruik van new om objecten aan te maken, wordt CDI gebruikt om afhankelijkheden te injecteren via @Inject. Dit zorgt ervoor dat de lagen los van elkaar staan en makkelijk te testen zijn. Door gebruik te maken van interfaces zoals ILoginService, IPlaylistService en ITrackService weet de resource laag niet welke implementatie er achter de interface zit.</w:t>
       </w:r>
     </w:p>
     <w:p>
@@ -2892,21 +2377,8 @@
       </w:pPr>
       <w:bookmarkStart w:id="19" w:name="_Toc226051188"/>
       <w:r>
-        <w:t xml:space="preserve">Data </w:t>
-      </w:r>
-      <w:proofErr w:type="spellStart"/>
-      <w:r>
-        <w:t>Mapper</w:t>
-      </w:r>
-      <w:proofErr w:type="spellEnd"/>
-      <w:r>
-        <w:t xml:space="preserve"> </w:t>
-      </w:r>
-      <w:proofErr w:type="spellStart"/>
-      <w:r>
-        <w:t>pattern</w:t>
-      </w:r>
-      <w:proofErr w:type="spellEnd"/>
+        <w:t>Data Mapper pattern</w:t>
+      </w:r>
       <w:r>
         <w:t>:</w:t>
       </w:r>
@@ -2914,47 +2386,7 @@
     </w:p>
     <w:p>
       <w:r>
-        <w:t xml:space="preserve">Voor elke entiteit is een aparte </w:t>
-      </w:r>
-      <w:proofErr w:type="spellStart"/>
-      <w:r>
-        <w:t>mapper</w:t>
-      </w:r>
-      <w:proofErr w:type="spellEnd"/>
-      <w:r>
-        <w:t xml:space="preserve"> klasse aangemaakt die verantwoordelijk is voor het omzetten van database resultaten naar DTO objecten. De </w:t>
-      </w:r>
-      <w:proofErr w:type="spellStart"/>
-      <w:r>
-        <w:t>LoginResponseMapper</w:t>
-      </w:r>
-      <w:proofErr w:type="spellEnd"/>
-      <w:r>
-        <w:t xml:space="preserve">, </w:t>
-      </w:r>
-      <w:proofErr w:type="spellStart"/>
-      <w:r>
-        <w:t>PlaylistMapper</w:t>
-      </w:r>
-      <w:proofErr w:type="spellEnd"/>
-      <w:r>
-        <w:t xml:space="preserve"> en </w:t>
-      </w:r>
-      <w:proofErr w:type="spellStart"/>
-      <w:r>
-        <w:t>TrackMapper</w:t>
-      </w:r>
-      <w:proofErr w:type="spellEnd"/>
-      <w:r>
-        <w:t xml:space="preserve"> implementeren allemaal de </w:t>
-      </w:r>
-      <w:proofErr w:type="spellStart"/>
-      <w:r>
-        <w:t>IMapper</w:t>
-      </w:r>
-      <w:proofErr w:type="spellEnd"/>
-      <w:r>
-        <w:t xml:space="preserve"> interface. Dit zorgt voor een duidelijke scheiding tussen de database logica en de domeinlogica.</w:t>
+        <w:t>Voor elke entiteit is een aparte mapper klasse aangemaakt die verantwoordelijk is voor het omzetten van database resultaten naar DTO objecten. De LoginResponseMapper, PlaylistMapper en TrackMapper implementeren allemaal de IMapper interface. Dit zorgt voor een duidelijke scheiding tussen de database logica en de domeinlogica.</w:t>
       </w:r>
     </w:p>
     <w:p/>
@@ -2965,14 +2397,9 @@
         <w:pStyle w:val="Heading2"/>
       </w:pPr>
       <w:bookmarkStart w:id="20" w:name="_Toc226051189"/>
-      <w:proofErr w:type="spellStart"/>
       <w:r>
         <w:lastRenderedPageBreak/>
-        <w:t>Separated</w:t>
-      </w:r>
-      <w:proofErr w:type="spellEnd"/>
-      <w:r>
-        <w:t xml:space="preserve"> Interface</w:t>
+        <w:t>Separated Interface</w:t>
       </w:r>
       <w:r>
         <w:t>:</w:t>
@@ -2981,23 +2408,7 @@
     </w:p>
     <w:p>
       <w:r>
-        <w:t xml:space="preserve">Alle lagen communiceren via interfaces met de laag eronder. De resource laag gebruikt service interfaces, de datasource laag gebruikt </w:t>
-      </w:r>
-      <w:proofErr w:type="spellStart"/>
-      <w:r>
-        <w:t>IDatabaseConnector</w:t>
-      </w:r>
-      <w:proofErr w:type="spellEnd"/>
-      <w:r>
-        <w:t xml:space="preserve"> en </w:t>
-      </w:r>
-      <w:proofErr w:type="spellStart"/>
-      <w:r>
-        <w:t>IMapper</w:t>
-      </w:r>
-      <w:proofErr w:type="spellEnd"/>
-      <w:r>
-        <w:t>. Dit maakt het makkelijk om de implementatie te wisselen zonder de rest van de applicatie aan te passen.</w:t>
+        <w:t>Alle lagen communiceren via interfaces met de laag eronder. De resource laag gebruikt service interfaces, de datasource laag gebruikt IDatabaseConnector en IMapper. Dit maakt het makkelijk om de implementatie te wisselen zonder de rest van de applicatie aan te passen.</w:t>
       </w:r>
     </w:p>
     <w:p>
@@ -3006,13 +2417,8 @@
       </w:pPr>
       <w:bookmarkStart w:id="21" w:name="_Toc226051190"/>
       <w:r>
-        <w:t xml:space="preserve">Unittests met </w:t>
-      </w:r>
-      <w:proofErr w:type="spellStart"/>
-      <w:r>
-        <w:t>Mockito</w:t>
-      </w:r>
-      <w:proofErr w:type="spellEnd"/>
+        <w:t>Unittests met Mockito</w:t>
+      </w:r>
       <w:r>
         <w:t>:</w:t>
       </w:r>
@@ -3026,39 +2432,7 @@
         <w:t>meerdere</w:t>
       </w:r>
       <w:r>
-        <w:t xml:space="preserve"> unittests geschreven die de werking van de applicatie aantonen. Door gebruik te maken van </w:t>
-      </w:r>
-      <w:proofErr w:type="spellStart"/>
-      <w:r>
-        <w:t>Mockito</w:t>
-      </w:r>
-      <w:proofErr w:type="spellEnd"/>
-      <w:r>
-        <w:t xml:space="preserve"> kunnen de interfaces </w:t>
-      </w:r>
-      <w:proofErr w:type="spellStart"/>
-      <w:r>
-        <w:t>gemockt</w:t>
-      </w:r>
-      <w:proofErr w:type="spellEnd"/>
-      <w:r>
-        <w:t xml:space="preserve"> worden zodat elke laag apart getest kan worden zonder database of server. Dit toont aan dat de lagen daadwerkelijk los van elkaar staan dankzij </w:t>
-      </w:r>
-      <w:proofErr w:type="spellStart"/>
-      <w:r>
-        <w:t>Dependency</w:t>
-      </w:r>
-      <w:proofErr w:type="spellEnd"/>
-      <w:r>
-        <w:t xml:space="preserve"> </w:t>
-      </w:r>
-      <w:proofErr w:type="spellStart"/>
-      <w:r>
-        <w:t>Injection</w:t>
-      </w:r>
-      <w:proofErr w:type="spellEnd"/>
-      <w:r>
-        <w:t>.</w:t>
+        <w:t xml:space="preserve"> unittests geschreven die de werking van de applicatie aantonen. Door gebruik te maken van Mockito kunnen de interfaces gemockt worden zodat elke laag apart getest kan worden zonder database of server. Dit toont aan dat de lagen daadwerkelijk los van elkaar staan dankzij Dependency Injection.</w:t>
       </w:r>
     </w:p>
     <w:p>
@@ -3076,15 +2450,7 @@
     </w:p>
     <w:p>
       <w:r>
-        <w:t xml:space="preserve">Om de </w:t>
-      </w:r>
-      <w:proofErr w:type="spellStart"/>
-      <w:r>
-        <w:t>Angular</w:t>
-      </w:r>
-      <w:proofErr w:type="spellEnd"/>
-      <w:r>
-        <w:t xml:space="preserve"> client te laten communiceren met de backend is een CORS filter toegevoegd. Deze filter voegt de juiste HTTP headers toe aan elke response zodat de browser verzoeken van andere domeinen toestaat.</w:t>
+        <w:t>Om de Angular client te laten communiceren met de backend is een CORS filter toegevoegd. Deze filter voegt de juiste HTTP headers toe aan elke response zodat de browser verzoeken van andere domeinen toestaat.</w:t>
       </w:r>
     </w:p>
     <w:p>
@@ -3102,29 +2468,7 @@
     </w:p>
     <w:p>
       <w:r>
-        <w:t xml:space="preserve">Na een succesvolle login wordt een uniek token aangemaakt via </w:t>
-      </w:r>
-      <w:proofErr w:type="spellStart"/>
-      <w:r>
-        <w:t>UUID.randomUUID</w:t>
-      </w:r>
-      <w:proofErr w:type="spellEnd"/>
-      <w:r>
-        <w:t>() en opgeslagen in de database. Bij elk volgend verzoek stuurt de client dit token</w:t>
-      </w:r>
-      <w:r>
-        <w:t xml:space="preserve"> </w:t>
-      </w:r>
-      <w:r>
-        <w:t xml:space="preserve">mee als query parameter. De server controleert het token bij elke </w:t>
-      </w:r>
-      <w:proofErr w:type="spellStart"/>
-      <w:r>
-        <w:t>request</w:t>
-      </w:r>
-      <w:proofErr w:type="spellEnd"/>
-      <w:r>
-        <w:t xml:space="preserve"> om te bepalen welke gebruiker ingelogd is.</w:t>
+        <w:t>Na een succesvolle login wordt een uniek token aangemaakt via UUID.randomUUID() en opgeslagen in de database. Bij elk volgend verzoek stuurt de client dit token mee als query parameter. De server controleert het token bij elke request om te bepalen welke gebruiker ingelogd is.</w:t>
       </w:r>
     </w:p>
     <w:p/>
@@ -6777,7 +6121,6 @@
   <w:style w:type="character" w:default="1" w:styleId="DefaultParagraphFont">
     <w:name w:val="Default Paragraph Font"/>
     <w:uiPriority w:val="1"/>
-    <w:semiHidden/>
     <w:unhideWhenUsed/>
   </w:style>
   <w:style w:type="table" w:default="1" w:styleId="TableNormal">
@@ -7870,6 +7213,7 @@
     <w:rsid w:val="00125F93"/>
     <w:rsid w:val="00175163"/>
     <w:rsid w:val="002B07B0"/>
+    <w:rsid w:val="002F1C3C"/>
     <w:rsid w:val="004056D0"/>
     <w:rsid w:val="004956E1"/>
     <w:rsid w:val="00520D8D"/>
@@ -7878,6 +7222,7 @@
     <w:rsid w:val="007C3C71"/>
     <w:rsid w:val="008B1242"/>
     <w:rsid w:val="00936A26"/>
+    <w:rsid w:val="00A91918"/>
     <w:rsid w:val="00AC2175"/>
     <w:rsid w:val="00AF2DB0"/>
     <w:rsid w:val="00B30700"/>
@@ -8580,6 +7925,15 @@
 </file>
 
 <file path=customXml/item1.xml><?xml version="1.0" encoding="utf-8"?>
+<?mso-contentType ?>
+<FormTemplates xmlns="http://schemas.microsoft.com/sharepoint/v3/contenttype/forms">
+  <Display>DocumentLibraryForm</Display>
+  <Edit>DocumentLibraryForm</Edit>
+  <New>DocumentLibraryForm</New>
+</FormTemplates>
+</file>
+
+<file path=customXml/item2.xml><?xml version="1.0" encoding="utf-8"?>
 <ct:contentTypeSchema xmlns:ct="http://schemas.microsoft.com/office/2006/metadata/contentType" xmlns:ma="http://schemas.microsoft.com/office/2006/metadata/properties/metaAttributes" ct:_="" ma:_="" ma:contentTypeName="Document" ma:contentTypeID="0x010100CFB92E751B2B6D4DA7AD9FF9E28E1603" ma:contentTypeVersion="13" ma:contentTypeDescription="Een nieuw document maken." ma:contentTypeScope="" ma:versionID="e63ee4bfd32aa15a8d1ac4e641b00677">
   <xsd:schema xmlns:xsd="http://www.w3.org/2001/XMLSchema" xmlns:xs="http://www.w3.org/2001/XMLSchema" xmlns:p="http://schemas.microsoft.com/office/2006/metadata/properties" xmlns:ns3="b81545ad-031d-4f83-bda2-49645f457759" xmlns:ns4="f90ba94e-ea65-42b5-be28-7cf1be02b767" targetNamespace="http://schemas.microsoft.com/office/2006/metadata/properties" ma:root="true" ma:fieldsID="a91ce29da5240f38562794e03dc8ffbf" ns3:_="" ns4:_="">
     <xsd:import namespace="b81545ad-031d-4f83-bda2-49645f457759"/>
@@ -8802,24 +8156,7 @@
 </ct:contentTypeSchema>
 </file>
 
-<file path=customXml/item2.xml><?xml version="1.0" encoding="utf-8"?>
-<?mso-contentType ?>
-<FormTemplates xmlns="http://schemas.microsoft.com/sharepoint/v3/contenttype/forms">
-  <Display>DocumentLibraryForm</Display>
-  <Edit>DocumentLibraryForm</Edit>
-  <New>DocumentLibraryForm</New>
-</FormTemplates>
-</file>
-
 <file path=customXml/item3.xml><?xml version="1.0" encoding="utf-8"?>
-<p:properties xmlns:p="http://schemas.microsoft.com/office/2006/metadata/properties" xmlns:xsi="http://www.w3.org/2001/XMLSchema-instance" xmlns:pc="http://schemas.microsoft.com/office/infopath/2007/PartnerControls">
-  <documentManagement>
-    <_activity xmlns="b81545ad-031d-4f83-bda2-49645f457759" xsi:nil="true"/>
-  </documentManagement>
-</p:properties>
-</file>
-
-<file path=customXml/item4.xml><?xml version="1.0" encoding="utf-8"?>
 <b:Sources xmlns:b="http://schemas.openxmlformats.org/officeDocument/2006/bibliography" xmlns="http://schemas.openxmlformats.org/officeDocument/2006/bibliography" SelectedStyle="\APASixthEditionOfficeOnline.xsl" StyleName="APA" Version="6">
   <b:Source>
     <b:Tag>HPi10</b:Tag>
@@ -8844,7 +8181,23 @@
 </b:Sources>
 </file>
 
+<file path=customXml/item4.xml><?xml version="1.0" encoding="utf-8"?>
+<p:properties xmlns:p="http://schemas.microsoft.com/office/2006/metadata/properties" xmlns:xsi="http://www.w3.org/2001/XMLSchema-instance" xmlns:pc="http://schemas.microsoft.com/office/infopath/2007/PartnerControls">
+  <documentManagement>
+    <_activity xmlns="b81545ad-031d-4f83-bda2-49645f457759" xsi:nil="true"/>
+  </documentManagement>
+</p:properties>
+</file>
+
 <file path=customXml/itemProps1.xml><?xml version="1.0" encoding="utf-8"?>
+<ds:datastoreItem xmlns:ds="http://schemas.openxmlformats.org/officeDocument/2006/customXml" ds:itemID="{A05A2F34-0CE7-4D6F-9850-E83E48AF91B1}">
+  <ds:schemaRefs>
+    <ds:schemaRef ds:uri="http://schemas.microsoft.com/sharepoint/v3/contenttype/forms"/>
+  </ds:schemaRefs>
+</ds:datastoreItem>
+</file>
+
+<file path=customXml/itemProps2.xml><?xml version="1.0" encoding="utf-8"?>
 <ds:datastoreItem xmlns:ds="http://schemas.openxmlformats.org/officeDocument/2006/customXml" ds:itemID="{2AD128ED-0FB8-49BB-AAB5-13E64029BCD1}">
   <ds:schemaRefs>
     <ds:schemaRef ds:uri="http://schemas.microsoft.com/office/2006/metadata/contentType"/>
@@ -8863,15 +8216,15 @@
 </ds:datastoreItem>
 </file>
 
-<file path=customXml/itemProps2.xml><?xml version="1.0" encoding="utf-8"?>
-<ds:datastoreItem xmlns:ds="http://schemas.openxmlformats.org/officeDocument/2006/customXml" ds:itemID="{A05A2F34-0CE7-4D6F-9850-E83E48AF91B1}">
+<file path=customXml/itemProps3.xml><?xml version="1.0" encoding="utf-8"?>
+<ds:datastoreItem xmlns:ds="http://schemas.openxmlformats.org/officeDocument/2006/customXml" ds:itemID="{FC5467D7-69FE-4180-BE19-1D4073F22D60}">
   <ds:schemaRefs>
-    <ds:schemaRef ds:uri="http://schemas.microsoft.com/sharepoint/v3/contenttype/forms"/>
+    <ds:schemaRef ds:uri="http://schemas.openxmlformats.org/officeDocument/2006/bibliography"/>
   </ds:schemaRefs>
 </ds:datastoreItem>
 </file>
 
-<file path=customXml/itemProps3.xml><?xml version="1.0" encoding="utf-8"?>
+<file path=customXml/itemProps4.xml><?xml version="1.0" encoding="utf-8"?>
 <ds:datastoreItem xmlns:ds="http://schemas.openxmlformats.org/officeDocument/2006/customXml" ds:itemID="{A96086A9-C93B-4195-9942-41863CCC68C6}">
   <ds:schemaRefs>
     <ds:schemaRef ds:uri="http://schemas.microsoft.com/office/2006/metadata/properties"/>
@@ -8879,12 +8232,4 @@
     <ds:schemaRef ds:uri="b81545ad-031d-4f83-bda2-49645f457759"/>
   </ds:schemaRefs>
 </ds:datastoreItem>
-</file>
-
-<file path=customXml/itemProps4.xml><?xml version="1.0" encoding="utf-8"?>
-<ds:datastoreItem xmlns:ds="http://schemas.openxmlformats.org/officeDocument/2006/customXml" ds:itemID="{FC5467D7-69FE-4180-BE19-1D4073F22D60}">
-  <ds:schemaRefs>
-    <ds:schemaRef ds:uri="http://schemas.openxmlformats.org/officeDocument/2006/bibliography"/>
-  </ds:schemaRefs>
-</ds:datastoreItem>
 </file>
</xml_diff>

<commit_message>
uml bestand toegevoegd(nieuwe want had de orginele niet geupload op git) en deployment diagram aangepast en verwerkt in word document
</commit_message>
<xml_diff>
--- a/document/SpotitubeDocument.docx
+++ b/document/SpotitubeDocument.docx
@@ -1731,11 +1731,11 @@
         </w:p>
       </w:sdtContent>
     </w:sdt>
-    <w:bookmarkStart w:id="0" w:name="_Toc453919959" w:displacedByCustomXml="prev"/>
-    <w:bookmarkStart w:id="1" w:name="_Toc453920324" w:displacedByCustomXml="prev"/>
+    <w:bookmarkStart w:id="0" w:name="_Toc453921976" w:displacedByCustomXml="prev"/>
+    <w:bookmarkStart w:id="1" w:name="_Toc453921523" w:displacedByCustomXml="prev"/>
     <w:bookmarkStart w:id="2" w:name="_Toc453921312" w:displacedByCustomXml="prev"/>
-    <w:bookmarkStart w:id="3" w:name="_Toc453921523" w:displacedByCustomXml="prev"/>
-    <w:bookmarkStart w:id="4" w:name="_Toc453921976" w:displacedByCustomXml="prev"/>
+    <w:bookmarkStart w:id="3" w:name="_Toc453920324" w:displacedByCustomXml="prev"/>
+    <w:bookmarkStart w:id="4" w:name="_Toc453919959" w:displacedByCustomXml="prev"/>
     <w:p>
       <w:r>
         <w:br w:type="page"/>
@@ -1854,27 +1854,14 @@
       <w:r>
         <w:t xml:space="preserve">Figure </w:t>
       </w:r>
-      <w:r>
-        <w:fldChar w:fldCharType="begin"/>
-      </w:r>
-      <w:r>
-        <w:instrText xml:space="preserve"> SEQ Figure \* ARABIC </w:instrText>
-      </w:r>
-      <w:r>
-        <w:fldChar w:fldCharType="separate"/>
-      </w:r>
-      <w:r>
-        <w:rPr>
-          <w:noProof/>
-        </w:rPr>
-        <w:t>1</w:t>
-      </w:r>
-      <w:r>
-        <w:rPr>
-          <w:noProof/>
-        </w:rPr>
-        <w:fldChar w:fldCharType="end"/>
-      </w:r>
+      <w:fldSimple w:instr=" SEQ Figure \* ARABIC ">
+        <w:r>
+          <w:rPr>
+            <w:noProof/>
+          </w:rPr>
+          <w:t>1</w:t>
+        </w:r>
+      </w:fldSimple>
       <w:r>
         <w:t xml:space="preserve"> PackageDiagram</w:t>
       </w:r>
@@ -2091,15 +2078,24 @@
       <w:bookmarkEnd w:id="11"/>
     </w:p>
     <w:p>
+      <w:pPr>
+        <w:keepNext/>
+        <w:spacing w:before="100" w:beforeAutospacing="1" w:after="100" w:afterAutospacing="1" w:line="240" w:lineRule="auto"/>
+      </w:pPr>
       <w:r>
         <w:rPr>
+          <w:rFonts w:ascii="Times New Roman" w:eastAsia="Times New Roman" w:hAnsi="Times New Roman" w:cs="Times New Roman"/>
           <w:noProof/>
+          <w:color w:val="auto"/>
+          <w:sz w:val="24"/>
+          <w:szCs w:val="24"/>
+          <w:lang w:val="en-NL" w:eastAsia="en-NL"/>
         </w:rPr>
         <w:drawing>
-          <wp:inline distT="0" distB="0" distL="0" distR="0" wp14:anchorId="732C8578" wp14:editId="41C79CDF">
-            <wp:extent cx="5831840" cy="4598670"/>
-            <wp:effectExtent l="0" t="0" r="0" b="0"/>
-            <wp:docPr id="1830960486" name="Picture 7"/>
+          <wp:inline distT="0" distB="0" distL="0" distR="0" wp14:anchorId="286C7809" wp14:editId="54701B34">
+            <wp:extent cx="5831840" cy="4454525"/>
+            <wp:effectExtent l="0" t="0" r="0" b="3175"/>
+            <wp:docPr id="1655946224" name="Picture 4"/>
             <wp:cNvGraphicFramePr>
               <a:graphicFrameLocks xmlns:a="http://schemas.openxmlformats.org/drawingml/2006/main" noChangeAspect="1"/>
             </wp:cNvGraphicFramePr>
@@ -2107,7 +2103,7 @@
               <a:graphicData uri="http://schemas.openxmlformats.org/drawingml/2006/picture">
                 <pic:pic xmlns:pic="http://schemas.openxmlformats.org/drawingml/2006/picture">
                   <pic:nvPicPr>
-                    <pic:cNvPr id="0" name="Picture 9"/>
+                    <pic:cNvPr id="0" name="Picture 1"/>
                     <pic:cNvPicPr>
                       <a:picLocks noChangeAspect="1" noChangeArrowheads="1"/>
                     </pic:cNvPicPr>
@@ -2128,7 +2124,7 @@
                   <pic:spPr bwMode="auto">
                     <a:xfrm>
                       <a:off x="0" y="0"/>
-                      <a:ext cx="5831840" cy="4598670"/>
+                      <a:ext cx="5831840" cy="4454525"/>
                     </a:xfrm>
                     <a:prstGeom prst="rect">
                       <a:avLst/>
@@ -2145,6 +2141,33 @@
         </w:drawing>
       </w:r>
     </w:p>
+    <w:p>
+      <w:pPr>
+        <w:pStyle w:val="Caption"/>
+        <w:rPr>
+          <w:rFonts w:ascii="Times New Roman" w:eastAsia="Times New Roman" w:hAnsi="Times New Roman" w:cs="Times New Roman"/>
+          <w:color w:val="auto"/>
+          <w:sz w:val="24"/>
+          <w:szCs w:val="24"/>
+          <w:lang w:val="en-NL" w:eastAsia="en-NL"/>
+        </w:rPr>
+      </w:pPr>
+      <w:r>
+        <w:t xml:space="preserve">Figure </w:t>
+      </w:r>
+      <w:fldSimple w:instr=" SEQ Figure \* ARABIC ">
+        <w:r>
+          <w:rPr>
+            <w:noProof/>
+          </w:rPr>
+          <w:t>2</w:t>
+        </w:r>
+      </w:fldSimple>
+      <w:r>
+        <w:t xml:space="preserve"> Deployment Diagram</w:t>
+      </w:r>
+    </w:p>
+    <w:p/>
     <w:p/>
     <w:p>
       <w:pPr>
@@ -2241,6 +2264,7 @@
           <w:b/>
           <w:bCs/>
         </w:rPr>
+        <w:lastRenderedPageBreak/>
         <w:t>Database configuratie via properties</w:t>
       </w:r>
       <w:r>
@@ -2386,7 +2410,11 @@
     </w:p>
     <w:p>
       <w:r>
-        <w:t>Voor elke entiteit is een aparte mapper klasse aangemaakt die verantwoordelijk is voor het omzetten van database resultaten naar DTO objecten. De LoginResponseMapper, PlaylistMapper en TrackMapper implementeren allemaal de IMapper interface. Dit zorgt voor een duidelijke scheiding tussen de database logica en de domeinlogica.</w:t>
+        <w:t xml:space="preserve">Voor elke entiteit is een aparte mapper klasse aangemaakt die verantwoordelijk is voor het omzetten van database resultaten naar DTO objecten. De LoginResponseMapper, PlaylistMapper en </w:t>
+      </w:r>
+      <w:r>
+        <w:lastRenderedPageBreak/>
+        <w:t>TrackMapper implementeren allemaal de IMapper interface. Dit zorgt voor een duidelijke scheiding tussen de database logica en de domeinlogica.</w:t>
       </w:r>
     </w:p>
     <w:p/>
@@ -2398,7 +2426,6 @@
       </w:pPr>
       <w:bookmarkStart w:id="20" w:name="_Toc226051189"/>
       <w:r>
-        <w:lastRenderedPageBreak/>
         <w:t>Separated Interface</w:t>
       </w:r>
       <w:r>
@@ -6121,6 +6148,7 @@
   <w:style w:type="character" w:default="1" w:styleId="DefaultParagraphFont">
     <w:name w:val="Default Paragraph Font"/>
     <w:uiPriority w:val="1"/>
+    <w:semiHidden/>
     <w:unhideWhenUsed/>
   </w:style>
   <w:style w:type="table" w:default="1" w:styleId="TableNormal">
@@ -7230,8 +7258,10 @@
     <w:rsid w:val="00BC329E"/>
     <w:rsid w:val="00BE1071"/>
     <w:rsid w:val="00C74526"/>
+    <w:rsid w:val="00CD1225"/>
     <w:rsid w:val="00D34614"/>
     <w:rsid w:val="00D73A47"/>
+    <w:rsid w:val="00E072AF"/>
     <w:rsid w:val="00E116EB"/>
     <w:rsid w:val="00E30130"/>
     <w:rsid w:val="00E477FF"/>
@@ -7925,15 +7955,6 @@
 </file>
 
 <file path=customXml/item1.xml><?xml version="1.0" encoding="utf-8"?>
-<?mso-contentType ?>
-<FormTemplates xmlns="http://schemas.microsoft.com/sharepoint/v3/contenttype/forms">
-  <Display>DocumentLibraryForm</Display>
-  <Edit>DocumentLibraryForm</Edit>
-  <New>DocumentLibraryForm</New>
-</FormTemplates>
-</file>
-
-<file path=customXml/item2.xml><?xml version="1.0" encoding="utf-8"?>
 <ct:contentTypeSchema xmlns:ct="http://schemas.microsoft.com/office/2006/metadata/contentType" xmlns:ma="http://schemas.microsoft.com/office/2006/metadata/properties/metaAttributes" ct:_="" ma:_="" ma:contentTypeName="Document" ma:contentTypeID="0x010100CFB92E751B2B6D4DA7AD9FF9E28E1603" ma:contentTypeVersion="13" ma:contentTypeDescription="Een nieuw document maken." ma:contentTypeScope="" ma:versionID="e63ee4bfd32aa15a8d1ac4e641b00677">
   <xsd:schema xmlns:xsd="http://www.w3.org/2001/XMLSchema" xmlns:xs="http://www.w3.org/2001/XMLSchema" xmlns:p="http://schemas.microsoft.com/office/2006/metadata/properties" xmlns:ns3="b81545ad-031d-4f83-bda2-49645f457759" xmlns:ns4="f90ba94e-ea65-42b5-be28-7cf1be02b767" targetNamespace="http://schemas.microsoft.com/office/2006/metadata/properties" ma:root="true" ma:fieldsID="a91ce29da5240f38562794e03dc8ffbf" ns3:_="" ns4:_="">
     <xsd:import namespace="b81545ad-031d-4f83-bda2-49645f457759"/>
@@ -8156,7 +8177,24 @@
 </ct:contentTypeSchema>
 </file>
 
+<file path=customXml/item2.xml><?xml version="1.0" encoding="utf-8"?>
+<?mso-contentType ?>
+<FormTemplates xmlns="http://schemas.microsoft.com/sharepoint/v3/contenttype/forms">
+  <Display>DocumentLibraryForm</Display>
+  <Edit>DocumentLibraryForm</Edit>
+  <New>DocumentLibraryForm</New>
+</FormTemplates>
+</file>
+
 <file path=customXml/item3.xml><?xml version="1.0" encoding="utf-8"?>
+<p:properties xmlns:p="http://schemas.microsoft.com/office/2006/metadata/properties" xmlns:xsi="http://www.w3.org/2001/XMLSchema-instance" xmlns:pc="http://schemas.microsoft.com/office/infopath/2007/PartnerControls">
+  <documentManagement>
+    <_activity xmlns="b81545ad-031d-4f83-bda2-49645f457759" xsi:nil="true"/>
+  </documentManagement>
+</p:properties>
+</file>
+
+<file path=customXml/item4.xml><?xml version="1.0" encoding="utf-8"?>
 <b:Sources xmlns:b="http://schemas.openxmlformats.org/officeDocument/2006/bibliography" xmlns="http://schemas.openxmlformats.org/officeDocument/2006/bibliography" SelectedStyle="\APASixthEditionOfficeOnline.xsl" StyleName="APA" Version="6">
   <b:Source>
     <b:Tag>HPi10</b:Tag>
@@ -8181,23 +8219,7 @@
 </b:Sources>
 </file>
 
-<file path=customXml/item4.xml><?xml version="1.0" encoding="utf-8"?>
-<p:properties xmlns:p="http://schemas.microsoft.com/office/2006/metadata/properties" xmlns:xsi="http://www.w3.org/2001/XMLSchema-instance" xmlns:pc="http://schemas.microsoft.com/office/infopath/2007/PartnerControls">
-  <documentManagement>
-    <_activity xmlns="b81545ad-031d-4f83-bda2-49645f457759" xsi:nil="true"/>
-  </documentManagement>
-</p:properties>
-</file>
-
 <file path=customXml/itemProps1.xml><?xml version="1.0" encoding="utf-8"?>
-<ds:datastoreItem xmlns:ds="http://schemas.openxmlformats.org/officeDocument/2006/customXml" ds:itemID="{A05A2F34-0CE7-4D6F-9850-E83E48AF91B1}">
-  <ds:schemaRefs>
-    <ds:schemaRef ds:uri="http://schemas.microsoft.com/sharepoint/v3/contenttype/forms"/>
-  </ds:schemaRefs>
-</ds:datastoreItem>
-</file>
-
-<file path=customXml/itemProps2.xml><?xml version="1.0" encoding="utf-8"?>
 <ds:datastoreItem xmlns:ds="http://schemas.openxmlformats.org/officeDocument/2006/customXml" ds:itemID="{2AD128ED-0FB8-49BB-AAB5-13E64029BCD1}">
   <ds:schemaRefs>
     <ds:schemaRef ds:uri="http://schemas.microsoft.com/office/2006/metadata/contentType"/>
@@ -8216,15 +8238,15 @@
 </ds:datastoreItem>
 </file>
 
-<file path=customXml/itemProps3.xml><?xml version="1.0" encoding="utf-8"?>
-<ds:datastoreItem xmlns:ds="http://schemas.openxmlformats.org/officeDocument/2006/customXml" ds:itemID="{FC5467D7-69FE-4180-BE19-1D4073F22D60}">
+<file path=customXml/itemProps2.xml><?xml version="1.0" encoding="utf-8"?>
+<ds:datastoreItem xmlns:ds="http://schemas.openxmlformats.org/officeDocument/2006/customXml" ds:itemID="{A05A2F34-0CE7-4D6F-9850-E83E48AF91B1}">
   <ds:schemaRefs>
-    <ds:schemaRef ds:uri="http://schemas.openxmlformats.org/officeDocument/2006/bibliography"/>
+    <ds:schemaRef ds:uri="http://schemas.microsoft.com/sharepoint/v3/contenttype/forms"/>
   </ds:schemaRefs>
 </ds:datastoreItem>
 </file>
 
-<file path=customXml/itemProps4.xml><?xml version="1.0" encoding="utf-8"?>
+<file path=customXml/itemProps3.xml><?xml version="1.0" encoding="utf-8"?>
 <ds:datastoreItem xmlns:ds="http://schemas.openxmlformats.org/officeDocument/2006/customXml" ds:itemID="{A96086A9-C93B-4195-9942-41863CCC68C6}">
   <ds:schemaRefs>
     <ds:schemaRef ds:uri="http://schemas.microsoft.com/office/2006/metadata/properties"/>
@@ -8232,4 +8254,12 @@
     <ds:schemaRef ds:uri="b81545ad-031d-4f83-bda2-49645f457759"/>
   </ds:schemaRefs>
 </ds:datastoreItem>
+</file>
+
+<file path=customXml/itemProps4.xml><?xml version="1.0" encoding="utf-8"?>
+<ds:datastoreItem xmlns:ds="http://schemas.openxmlformats.org/officeDocument/2006/customXml" ds:itemID="{FC5467D7-69FE-4180-BE19-1D4073F22D60}">
+  <ds:schemaRefs>
+    <ds:schemaRef ds:uri="http://schemas.openxmlformats.org/officeDocument/2006/bibliography"/>
+  </ds:schemaRefs>
+</ds:datastoreItem>
 </file>
</xml_diff>